<commit_message>
Set contract date to 1st September 2026 and pre-fill signature block names
</commit_message>
<xml_diff>
--- a/DASHit_Contract_Version1.docx
+++ b/DASHit_Contract_Version1.docx
@@ -32,7 +32,7 @@
         <w:t xml:space="preserve">Agreement Date: </w:t>
       </w:r>
       <w:r>
-        <w:t>2nd September 2026</w:t>
+        <w:t>1st September 2026</w:t>
         <w:br/>
       </w:r>
       <w:r>
@@ -539,7 +539,7 @@
               <w:br/>
               <w:t>Name: Muhammad Aleem Kanyu</w:t>
               <w:br/>
-              <w:t>Date: _______________________________</w:t>
+              <w:t>Date: 1st September 2026</w:t>
             </w:r>
           </w:p>
         </w:tc>
@@ -556,7 +556,7 @@
               <w:br/>
               <w:t>Name: Azan Iqbal Mir</w:t>
               <w:br/>
-              <w:t>Date: _______________________________</w:t>
+              <w:t>Date: 1st September 2026</w:t>
             </w:r>
           </w:p>
         </w:tc>

</xml_diff>